<commit_message>
fourth change - implementation of references
</commit_message>
<xml_diff>
--- a/Perfil de grado.docx
+++ b/Perfil de grado.docx
@@ -5,148 +5,199 @@
     <w:p>
       <w:pPr>
         <w:jc w:val="center"/>
-      </w:pPr>
-      <w:bookmarkStart w:id="0" w:name="_Toc238597700"/>
-      <w:r>
-        <w:t xml:space="preserve">Sistema de geolocalización en tiempo real para la búsqueda </w:t>
-      </w:r>
-      <w:r>
-        <w:t>inteligente de productos y comida con rutas de acceso en la ciudad de Cochabamba</w:t>
-      </w:r>
-    </w:p>
-    <w:p>
-      <w:pPr>
-        <w:pStyle w:val="Ttulo1"/>
-        <w:rPr>
-          <w:b/>
-          <w:bCs/>
-        </w:rPr>
-      </w:pPr>
-      <w:r>
-        <w:rPr>
-          <w:b/>
-          <w:bCs/>
-        </w:rPr>
-        <w:t>Antecedentes</w:t>
-      </w:r>
-      <w:bookmarkEnd w:id="0"/>
-    </w:p>
-    <w:p>
-      <w:pPr>
         <w:rPr>
           <w:sz w:val="24"/>
           <w:szCs w:val="24"/>
         </w:rPr>
       </w:pPr>
+      <w:bookmarkStart w:id="0" w:name="_Toc238597700"/>
       <w:r>
         <w:rPr>
           <w:sz w:val="24"/>
           <w:szCs w:val="24"/>
         </w:rPr>
-        <w:t xml:space="preserve">La referencia más conocida es Google Maps, </w:t>
-      </w:r>
-      <w:r>
-        <w:rPr>
-          <w:sz w:val="24"/>
-          <w:szCs w:val="24"/>
-        </w:rPr>
-        <w:t xml:space="preserve">que permite ver cuando el negocio </w:t>
-      </w:r>
-      <w:r>
-        <w:rPr>
-          <w:sz w:val="24"/>
-          <w:szCs w:val="24"/>
-        </w:rPr>
-        <w:t>esta abierto</w:t>
-      </w:r>
-      <w:r>
-        <w:rPr>
-          <w:sz w:val="24"/>
-          <w:szCs w:val="24"/>
-        </w:rPr>
-        <w:t xml:space="preserve"> o cerrado y en que horarios atiende.</w:t>
+        <w:t>Sistema de geolocalización en tiempo real para la búsqueda inteligente de productos y comida con rutas de acceso en la ciudad de Cochabamba</w:t>
       </w:r>
     </w:p>
     <w:p>
       <w:pPr>
+        <w:pStyle w:val="Ttulo1"/>
         <w:rPr>
-          <w:b/>
-          <w:bCs/>
-          <w:sz w:val="24"/>
-          <w:szCs w:val="24"/>
+          <w:b w:val="0"/>
         </w:rPr>
       </w:pPr>
       <w:r>
-        <w:rPr>
-          <w:sz w:val="24"/>
-          <w:szCs w:val="24"/>
-        </w:rPr>
-        <w:t xml:space="preserve">PedidosYa, que desde su llegada a la ciudad permite el servicio de reparto de restaurantes, farmacias, bebidas, supermercados y tiendas a través de su sitio web y aplicaciones en iOS y Android, y más recientemente Yango, que ofrece un servicio similar de pedidos y promociones locales. </w:t>
-      </w:r>
+        <w:t>Antecedentes</w:t>
+      </w:r>
+      <w:bookmarkEnd w:id="0"/>
     </w:p>
     <w:p>
       <w:pPr>
-        <w:rPr>
-          <w:sz w:val="24"/>
-          <w:szCs w:val="24"/>
-        </w:rPr>
-      </w:pPr>
-      <w:r>
-        <w:rPr>
-          <w:sz w:val="24"/>
-          <w:szCs w:val="24"/>
-        </w:rPr>
-        <w:t xml:space="preserve">FindItApp destacan por su capacidad de buscar productos específicos al mejor precio, contando con un catálogo de más de 60,000 productos, además de una función de escaneo de códigos de barras y notificaciones sobre las mejores ofertas cerca del usuario gracias a la geolocalización. </w:t>
-      </w:r>
+        <w:pStyle w:val="NormasApa70"/>
+      </w:pPr>
+      <w:r>
+        <w:t xml:space="preserve">La referencia más conocida es Google </w:t>
+      </w:r>
+      <w:proofErr w:type="spellStart"/>
+      <w:r>
+        <w:t>Maps</w:t>
+      </w:r>
+      <w:proofErr w:type="spellEnd"/>
+      <w:r>
+        <w:t xml:space="preserve">, </w:t>
+      </w:r>
+      <w:r>
+        <w:t xml:space="preserve">que permite ver cuando el negocio </w:t>
+      </w:r>
+      <w:r>
+        <w:t>está</w:t>
+      </w:r>
+      <w:r>
+        <w:t xml:space="preserve"> abierto</w:t>
+      </w:r>
+      <w:r>
+        <w:t xml:space="preserve"> o cerrado y en que horarios atiende.</w:t>
+      </w:r>
+      <w:sdt>
+        <w:sdtPr>
+          <w:id w:val="269293343"/>
+          <w:citation/>
+        </w:sdtPr>
+        <w:sdtContent>
+          <w:r>
+            <w:fldChar w:fldCharType="begin"/>
+          </w:r>
+          <w:r>
+            <w:instrText xml:space="preserve"> CITATION Goo26 \l 16394 </w:instrText>
+          </w:r>
+          <w:r>
+            <w:fldChar w:fldCharType="separate"/>
+          </w:r>
+          <w:r>
+            <w:rPr>
+              <w:noProof/>
+            </w:rPr>
+            <w:t xml:space="preserve"> (Google LLC, 2026)</w:t>
+          </w:r>
+          <w:r>
+            <w:fldChar w:fldCharType="end"/>
+          </w:r>
+        </w:sdtContent>
+      </w:sdt>
     </w:p>
     <w:p>
       <w:pPr>
-        <w:rPr>
-          <w:sz w:val="24"/>
-          <w:szCs w:val="24"/>
-        </w:rPr>
-      </w:pPr>
-      <w:r>
-        <w:rPr>
-          <w:sz w:val="24"/>
-          <w:szCs w:val="24"/>
-        </w:rPr>
-        <w:t xml:space="preserve">De forma similar, la app de la Organización de Consumidores y Usuarios permite averiguar dónde encontrar determinados productos y qué comercios los ofrecen al mejor precio, tanto online como en tienda física, a partir de geolocalización, con una base de datos de más de 150.000 productos. </w:t>
-      </w:r>
+        <w:pStyle w:val="NormasApa70"/>
+      </w:pPr>
+      <w:proofErr w:type="spellStart"/>
+      <w:r>
+        <w:t>PedidosYa</w:t>
+      </w:r>
+      <w:proofErr w:type="spellEnd"/>
+      <w:r>
+        <w:t xml:space="preserve">, que desde su llegada a la ciudad permite el servicio de reparto de restaurantes, farmacias, bebidas, supermercados y tiendas a través de su sitio web y aplicaciones en iOS y Android, que ofrece un servicio similar de pedidos y promociones locales. </w:t>
+      </w:r>
+      <w:sdt>
+        <w:sdtPr>
+          <w:id w:val="-1622687185"/>
+          <w:citation/>
+        </w:sdtPr>
+        <w:sdtContent>
+          <w:r>
+            <w:fldChar w:fldCharType="begin"/>
+          </w:r>
+          <w:r>
+            <w:instrText xml:space="preserve">CITATION Ped26 \l 16394 </w:instrText>
+          </w:r>
+          <w:r>
+            <w:fldChar w:fldCharType="separate"/>
+          </w:r>
+          <w:r>
+            <w:rPr>
+              <w:noProof/>
+            </w:rPr>
+            <w:t>(PedidosYa S.A, 2026)</w:t>
+          </w:r>
+          <w:r>
+            <w:fldChar w:fldCharType="end"/>
+          </w:r>
+        </w:sdtContent>
+      </w:sdt>
     </w:p>
     <w:p>
       <w:pPr>
-        <w:rPr>
-          <w:b/>
-          <w:bCs/>
-        </w:rPr>
-      </w:pPr>
-      <w:r>
-        <w:rPr>
-          <w:sz w:val="24"/>
-          <w:szCs w:val="24"/>
-        </w:rPr>
-        <w:t>En Argentina existe un antecedente similar con la app Comprando, que permite localizar el precio más barato de un producto usando los listados oficiales de precios de supermercados</w:t>
-      </w:r>
+        <w:pStyle w:val="NormasApa70"/>
+      </w:pPr>
+      <w:r>
+        <w:t>Yango, que desde su llegada a la ciudad permite el servicio de transporte de pasajeros, logística y envío de paquetería a través de su aplicación móvil disponible para iOS y Android, que ofrece un servicio de movilidad urbana basado en la geolocalización y el seguimiento de vehículos en tiempo real.</w:t>
+      </w:r>
+      <w:r>
+        <w:t xml:space="preserve"> </w:t>
+      </w:r>
+      <w:sdt>
+        <w:sdtPr>
+          <w:id w:val="-2051837843"/>
+          <w:citation/>
+        </w:sdtPr>
+        <w:sdtContent>
+          <w:r>
+            <w:fldChar w:fldCharType="begin"/>
+          </w:r>
+          <w:r>
+            <w:instrText xml:space="preserve"> CITATION YHu26 \l 16394 </w:instrText>
+          </w:r>
+          <w:r>
+            <w:fldChar w:fldCharType="separate"/>
+          </w:r>
+          <w:r>
+            <w:rPr>
+              <w:noProof/>
+            </w:rPr>
+            <w:t>(Y Hub Zaf, 2026)</w:t>
+          </w:r>
+          <w:r>
+            <w:fldChar w:fldCharType="end"/>
+          </w:r>
+        </w:sdtContent>
+      </w:sdt>
     </w:p>
     <w:p>
       <w:pPr>
-        <w:rPr>
-          <w:sz w:val="24"/>
-          <w:szCs w:val="24"/>
-        </w:rPr>
-      </w:pPr>
-      <w:r>
-        <w:rPr>
-          <w:sz w:val="24"/>
-          <w:szCs w:val="24"/>
-        </w:rPr>
+        <w:pStyle w:val="NormasApa70"/>
+      </w:pPr>
+      <w:r>
         <w:t>Trufi App es una aplicación móvil que permite visualizar las rutas de transporte público para desplazarse desde un punto de origen hasta un destino. El sistema calcula el tiempo estimado de viaje y ofrece múltiples alternativas de transporte, basándose en los puntos establecidos manualmente por el usuario o utilizando su ubicación actual mediante geolocalización.</w:t>
       </w:r>
+      <w:sdt>
+        <w:sdtPr>
+          <w:id w:val="-21017486"/>
+          <w:citation/>
+        </w:sdtPr>
+        <w:sdtContent>
+          <w:r>
+            <w:fldChar w:fldCharType="begin"/>
+          </w:r>
+          <w:r>
+            <w:instrText xml:space="preserve"> CITATION Tru26 \l 16394 </w:instrText>
+          </w:r>
+          <w:r>
+            <w:fldChar w:fldCharType="separate"/>
+          </w:r>
+          <w:r>
+            <w:rPr>
+              <w:noProof/>
+            </w:rPr>
+            <w:t xml:space="preserve"> (Trufi Association, 2026)</w:t>
+          </w:r>
+          <w:r>
+            <w:fldChar w:fldCharType="end"/>
+          </w:r>
+        </w:sdtContent>
+      </w:sdt>
     </w:p>
     <w:p>
       <w:pPr>
-        <w:pStyle w:val="NormasAPA"/>
+        <w:pStyle w:val="Ttulo1"/>
         <w:rPr>
           <w:szCs w:val="24"/>
         </w:rPr>
@@ -162,7 +213,11 @@
         <w:pStyle w:val="NormasApa70"/>
       </w:pPr>
       <w:r>
-        <w:t>Cuando una persona busca un lugar para comer en la ciudad de Cercado, muchas veces, por falta de tiempo o para evitar la fatiga de buscar, termina conformándose con el primer restaurante que se cruza en su camino. Al hacer esto, deja pasar opciones que podrían ofrecer mejores precios, excelentes reseñas, o incluso un restaurante mucho mejor ubicado a solo unos metros de su posición. Esta situación es aún más común para alguien que llega por primera vez a la ciudad: al no conocer la zona, entra a cualquier local a ciegas, sin saber los precios ni la calidad de lo que va a consumir. A veces, simplemente tenemos el antojo de un plato en específico, pero encontrar el lugar ideal que lo ofrezca y que cuente con buenas recomendaciones para ayudarnos a decidir resulta ser una tarea complicada.</w:t>
+        <w:t xml:space="preserve">Cuando una persona busca un lugar para comer en la ciudad de Cercado, frecuentemente, por limitaciones de tiempo o para minimizar el esfuerzo de búsqueda, termina optando por el primer establecimiento disponible. Al hacerlo, omite alternativas cercanas que podrían ofrecer una mejor relación calidad-precio o valoraciones superiores. Esta situación se acentúa en individuos no residentes que, al desconocer la zona, ingresan a un local sin </w:t>
+      </w:r>
+      <w:r>
+        <w:lastRenderedPageBreak/>
+        <w:t>información previa sobre los costos o la calidad del servicio. Asimismo, cuando existe la intención de consumir un plato en específico, encontrar el establecimiento adecuado que lo ofrezca y que cuente con recomendaciones confiables resulta ser una tarea compleja.</w:t>
       </w:r>
     </w:p>
     <w:p>
@@ -170,14 +225,7 @@
         <w:pStyle w:val="NormasApa70"/>
       </w:pPr>
       <w:r>
-        <w:lastRenderedPageBreak/>
-        <w:t>Incluso cuando encontramos una opción que nos llama la atención, o queremos volver a un lugar conocido, chocamos con la incertidumbre: no hay forma segura de saber si en ese momento exacto está abierto o si sus horarios habituales son reales. Es muy frustrante hacer el esfuerzo y a veces el gast</w:t>
-      </w:r>
-      <w:r>
-        <w:t>o</w:t>
-      </w:r>
-      <w:r>
-        <w:t xml:space="preserve"> de trasladarse hasta el lugar solo para descubrir que hoy está cerrado. Si bien muchos locales tienen redes sociales, rara vez las actualizan en tiempo real para avisar de una emergencia que los obligó a cerrar. Peor aún es volver a un restaurante después de un tiempo y toparte con que cerró definitivamente o se mudó; si no conoces sus páginas o redes, te quedas sin forma de rastrearlo. Al final, después de perder tiempo tratando de ir a un buen lugar, la frustración te quita las ganas de seguir buscando y simplemente decides irte.</w:t>
+        <w:t>Incluso cuando se identifica una opción de interés o se desea retornar a un establecimiento conocido, el usuario se enfrenta a la incertidumbre no existe certeza de que el lugar se encuentre abierto en ese instante o de que sus horarios publicados sean precisos. Resulta ineficiente invertir tiempo y recursos económicos en trasladarse para descubrir que el local está cerrado. Aunque muchos negocios cuentan con redes sociales, rara vez las actualizan en tiempo real ante emergencias que obligan a interrumpir la atención. La situación se agrava si un restaurante cesó sus operaciones definitivamente o cambió de dirección; ante la falta de canales digitales actualizados, el usuario carece de medios para localizarlo, lo que genera insatisfacción y el abandono de la búsqueda.</w:t>
       </w:r>
     </w:p>
     <w:p>
@@ -185,7 +233,7 @@
         <w:pStyle w:val="NormasApa70"/>
       </w:pPr>
       <w:r>
-        <w:t>Y el problema no termina ahí. Cuando recibes una recomendación de un lugar que se encuentra a una distancia considerable y decides ir, te enfrentas al lío de la ubicación y la movilidad. Al no conocer con exactitud dónde queda ni cuál es la mejor ruta, te quedas adivinando qué línea de transporte tomar o te ves obligado a preguntarle a la gente en la calle qué trufi o micro pasa por ahí. Todo esto sin darte cuenta de que, analizando tu posición actual, quizás era mucho más rápido y barato llegar simplemente caminando.</w:t>
+        <w:t>A esto se suma el desafío logístico de la movilidad. Cuando un usuario decide dirigirse a un lugar recomendado y distante, se enfrenta a la falta de información geoespacial precisa. Al desconocer la ubicación exacta y las rutas óptimas, carece de datos para determinar qué línea de transporte público utilizar. Esto impide al usuario evaluar si, en función de su ubicación actual, un desplazamiento peatonal resultaría más rápido y económico.</w:t>
       </w:r>
     </w:p>
     <w:p>
@@ -193,19 +241,7 @@
         <w:pStyle w:val="NormasApa70"/>
       </w:pPr>
       <w:r>
-        <w:t>A</w:t>
-      </w:r>
-      <w:r>
-        <w:t xml:space="preserve"> </w:t>
-      </w:r>
-      <w:r>
-        <w:t xml:space="preserve">toda esta falta de información </w:t>
-      </w:r>
-      <w:r>
-        <w:t>clara, hace</w:t>
-      </w:r>
-      <w:r>
-        <w:t xml:space="preserve"> que algo tan sencillo como salir a comer se convierta en un dolor de cabeza. Esta situación se vuelve todavía más caótica cuando estás con un grupo de amigos y nadie conoce un lugar que tenga los platos específicos que cada integrante desea consumir. Todo esto nos lleva a lo mismo: dar vueltas en vano, gastar dinero en pasajes innecesarios y perder un tiempo valioso que podríamos habernos ahorrado.</w:t>
+        <w:t>Esta carencia de información centralizada transforma una actividad cotidiana en un proceso ineficiente y problemático. La dificultad se multiplica en salidas grupales, donde es necesario conciliar las preferencias gastronómicas de varios integrantes sin conocer un lugar que satisfaga todas las demandas. En consecuencia, se producen desplazamientos innecesarios, gastos redundantes en transporte y una pérdida de tiempo considerable.</w:t>
       </w:r>
     </w:p>
     <w:p>
@@ -213,25 +249,7 @@
         <w:pStyle w:val="NormasApa70"/>
       </w:pPr>
       <w:r>
-        <w:t xml:space="preserve">A todo </w:t>
-      </w:r>
-      <w:r>
-        <w:t>esto,</w:t>
-      </w:r>
-      <w:r>
-        <w:t xml:space="preserve"> se suma el problema de las promociones. Hoy en día, los restaurantes publican sus ofertas en redes sociales, pero al no tener esta información centralizada, terminas enterándote por un amigo cuando ya es tarde o te topas con la publicación de una promoción que ya expiró. Resulta frustrante no tener manera de saber si un local cercano tiene una oferta activa en ese momento</w:t>
-      </w:r>
-      <w:r>
-        <w:t xml:space="preserve"> </w:t>
-      </w:r>
-      <w:r>
-        <w:t>como un 2x1</w:t>
-      </w:r>
-      <w:r>
-        <w:t xml:space="preserve"> </w:t>
-      </w:r>
-      <w:r>
-        <w:t>de la cual podrías haber disfrutado con tu familia o amigos si tan solo te hubieras enterado a tiempo.</w:t>
+        <w:t>Otro aspecto crítico es la fragmentación en la difusión de promociones. En la actualidad, los restaurantes publican sus ofertas en redes sociales de manera aislada, ocasionando que los consumidores se enteren tardíamente mediante terceros o descubran publicaciones que ya han expirado. La imposibilidad de conocer en tiempo real si un establecimiento cercano ofrece descuentos activos (como ofertas 2x1) impide que los usuarios aprovechen estas oportunidades comerciales de manera oportuna.</w:t>
       </w:r>
     </w:p>
     <w:p>
@@ -239,7 +257,7 @@
         <w:pStyle w:val="NormasApa70"/>
       </w:pPr>
       <w:r>
-        <w:t>Por otro lado, cuando una persona necesita comprar un producto en específico, la dinámica habitual consiste en preguntar a conocidos o dirigirse a ciegas a grandes centros de abasto o mercados con la esperanza de encontrarlo. Sin embargo, este recorrido se realiza sin tener la certeza previa de si el artículo realmente está disponible en ese lugar o si siquiera se comercializa allí. Todo esto conlleva a realizar búsquedas físicas agotadoras, caminar de un lado a otro en vano y perder un tiempo muy valioso tratando de adivinar en qué pasillo o sector podrían venderlo.</w:t>
+        <w:t>Por otro lado, en el ámbito comercial general, cuando un individuo requiere adquirir un producto específico, el procedimiento habitual consiste en consultar a terceros o dirigirse empíricamente a grandes centros de abasto o mercados. Este recorrido se efectúa sin confirmación previa sobre la disponibilidad del artículo en dicho lugar. Esto deriva en búsquedas físicas exhaustivas, recorridos infructuosos y un gasto de tiempo considerable al intentar ubicar el sector o pasillo correspondiente.</w:t>
       </w:r>
     </w:p>
     <w:p>
@@ -247,7 +265,7 @@
         <w:pStyle w:val="NormasApa70"/>
       </w:pPr>
       <w:r>
-        <w:t>Además, incluso si la persona corre con suerte y logra encontrar el producto deseado, se enfrenta a un nuevo obstáculo: la falta de opciones para comparar. Al no tener un panorama claro, desconoce por completo si en los puestos o tiendas aledañas existen alternativas iguales o de calidad similar a un precio mucho más conveniente. Peor aún, muchas veces ignora que ese mismo artículo estaba disponible en una tienda de barrio mucho más cercana a su ubicación original, lo que le habría ahorrado todo el viaje al mercado central. En definitiva, esta ausencia de información restringe drásticamente su capacidad para evaluar alternativas, impidiéndole tomar una decisión de compra inteligente y económica.</w:t>
+        <w:t>Aun si el comprador logra localizar el producto, surge un nuevo obstáculo: la falta de herramientas para la comparación de precios. Al no disponer de un panorama comercial claro, el usuario desconoce si existen alternativas idénticas o similares a precios más competitivos en comercios adyacentes. Frecuentemente, ignora que el mismo artículo estaba disponible en una tienda de barrio cercana a su punto de partida, lo cual le habría evitado el traslado hasta el mercado central. Esta deficiencia informativa restringe su capacidad analítica, impidiendo una decisión de compra óptima y económica.</w:t>
       </w:r>
     </w:p>
     <w:p>
@@ -255,7 +273,7 @@
         <w:pStyle w:val="NormasApa70"/>
       </w:pPr>
       <w:r>
-        <w:t>A esto se suma la desconexión total respecto a las ofertas y las constantes fluctuaciones de precios. Actualmente, el consumidor no tiene cómo enterarse si un producto bajó de precio o si una tienda cercana lanzó una promoción especial. Tener acceso a esta información es clave: si alguien se entera a tiempo de un buen descuento, podría aprovecharlo para adquirir un artículo que sabe que necesitará más adelante, incluso si no le urge en ese preciso instante. En tiempos donde los precios son inestables y varían constantemente, resulta vital saber qué lugares mantienen costos más justos o dónde encontrar una rebaja para un producto que, en otros lados, ya se ofrece demasiado caro.</w:t>
+        <w:t>Adicionalmente, existe una desconexión respecto a las fluctuaciones de precios. El consumidor carece de un sistema que le alerte sobre reducciones de costos o promociones especiales en su entorno cercano. Disponer de esta información permitiría la planificación de compras anticipadas para artículos de necesidad futura. En contextos de inestabilidad económica con precios variables, es fundamental identificar qué establecimientos mantienen tarifas justas o aplican rebajas frente a comercios con precios elevados.</w:t>
       </w:r>
     </w:p>
     <w:p>
@@ -263,7 +281,7 @@
         <w:pStyle w:val="NormasApa70"/>
       </w:pPr>
       <w:r>
-        <w:t>Desde la perspectiva de quienes ofrecen los productos, la situación también está llena de obstáculos que dificultan concretar las ventas. Hoy en día, la mayoría de los comerciantes y emprendedores recurren a las redes sociales como su principal y única vitrina. Sin embargo, depender exclusivamente de esto es un arma de doble filo, ya que la visibilidad del negocio queda a merced del capricho de un algoritmo. Por ejemplo, el dueño de una tienda puede subir un video mostrando un nuevo lote de mercadería; este video podría volverse viral y recibir miles de vistas de personas en otras ciudades que solo están viendo contenido por entretenimiento. Mientras tanto, un vecino a unas cuantas cuadras que realmente necesita comprar ese artículo hoy mismo, jamás se entera porque la aplicación simplemente no le mostró la publicación en su pantalla de inicio. El alcance se basa en la suerte, no en la necesidad directa de un comprador.</w:t>
+        <w:t>Desde la perspectiva de la oferta, los comerciantes enfrentan barreras estructurales para concretar ventas. Actualmente, la mayoría de los emprendedores utilizan las redes sociales como su principal canal de exhibición. Sin embargo, depender exclusivamente de estas plataformas representa una limitación comercial significativa, dado que la visibilidad del negocio queda subordinada a los algoritmos de recomendación. Por ejemplo, una publicación sobre nuevo inventario puede recibir alto tráfico de usuarios en otras ciudades sin intención de compra, mientras que un consumidor local, ubicado a pocas cuadras y con necesidad inmediata del producto, no visualiza la oferta. El alcance publicitario depende de métricas de interacción en lugar de la intención directa de búsqueda del cliente.</w:t>
       </w:r>
     </w:p>
     <w:p>
@@ -271,7 +289,7 @@
         <w:pStyle w:val="NormasApa70"/>
       </w:pPr>
       <w:r>
-        <w:t>A esto se suma la falta de claridad que termina frenando la decisión de compra. Incluso en los casos donde el algoritmo sí logra mostrarle el negocio a un posible cliente local, la publicación suele carecer de información operativa vital. El usuario ve algo que le gusta, pero se topa con la frustración de no ver un precio claro, viéndose obligado a comentar o mandar un mensaje privado y esperar horas por una respuesta. Además, no tiene forma de saber si el video que está viendo es reciente o si ese producto en específico ya se agotó hace días. Ante esta falta de datos exactos, la persona simplemente desiste; no se va a arriesgar a gastar tiempo, esfuerzo y dinero en pasajes para trasladarse hasta el local, si no tiene la plena seguridad de que el producto sigue disponible y se ajusta a su presupuesto.</w:t>
+        <w:t>A esto se suma la falta de información operativa en las publicaciones, lo que detiene el proceso de compra. Incluso cuando el sistema muestra el negocio a un cliente local, el contenido suele carecer de datos fundamentales, como precios actualizados. Esto obliga al usuario a iniciar un proceso de consulta asíncrono, retrasando la transacción. Además, no es posible verificar si el producto mostrado sigue en inventario. Ante esta falta de precisión, el cliente desiste del traslado al establecimiento para evitar el riesgo de invertir tiempo y recursos sin garantía de disponibilidad.</w:t>
       </w:r>
     </w:p>
     <w:p>
@@ -279,13 +297,7 @@
         <w:pStyle w:val="NormasApa70"/>
       </w:pPr>
       <w:r>
-        <w:t>Por todo esto, los comerciantes se enfrentan a una necesidad urgente: requieren mucho más que publicaciones fugaces que quedan enterradas en el historial de una red social en cuestión de días. Necesitan un espacio que funcione como un catálogo constante, ordenado y siempre accesible</w:t>
-      </w:r>
-      <w:r>
-        <w:t xml:space="preserve"> para que la persona</w:t>
-      </w:r>
-      <w:r>
-        <w:t xml:space="preserve"> con una intención real de compra pueda buscar directamente lo que necesita, revisar los precios actualizados y confirmar la ubicación exacta en el momento que lo desee. De esta manera, el comerciante deja de depender de la casualidad para vender, y el cliente obtiene la certeza que necesita para decidirse a ir al local.</w:t>
+        <w:t>Por consiguiente, los comerciantes tienen la necesidad imperativa de contar con herramientas tecnológicas que superen las limitaciones del contenido efímero de las redes sociales. Requieren un sistema que funcione como un catálogo digital permanente, estructurado y accesible en todo momento. Esto permitiría a los usuarios con intención real de compra realizar búsquedas directas, verificar precios y obtener la geolocalización exacta del local, mitigando la dependencia del alcance orgánico y otorgando certeza operativa a la transacción.</w:t>
       </w:r>
     </w:p>
     <w:p>
@@ -293,19 +305,10 @@
         <w:pStyle w:val="NormasApa70"/>
       </w:pPr>
       <w:r>
-        <w:t>Finalmente, este problema de visibilidad y ubicación se vuelve todavía más crítico cuando hablamos de los vendedores ambulantes. Al no contar con un puesto físico o un local fijo</w:t>
-      </w:r>
-      <w:r>
-        <w:t xml:space="preserve"> de venta</w:t>
-      </w:r>
-      <w:r>
-        <w:t>, la esencia misma de su trabajo es el movimiento constante, cambiando de calle, esquina o barrio a lo largo del día</w:t>
-      </w:r>
-      <w:r>
-        <w:t xml:space="preserve"> como una persona que vende helados y recorre lugares o barrios de la cuidad haciendo sonar una bocina representativo</w:t>
-      </w:r>
-      <w:r>
-        <w:t>. Sin embargo, su mayor obstáculo es que actualmente no cuentan con ningún mecanismo que les permita avisar dónde se encuentran o cuál será su recorrido de la jornada.</w:t>
+        <w:t>Luego</w:t>
+      </w:r>
+      <w:r>
+        <w:t xml:space="preserve"> este problema de visibilidad y geolocalización se agudiza en el caso de los vendedores ambulantes. Al carecer de un punto de venta fijo, su modelo de negocio se basa en el desplazamiento continuo por diversas zonas urbanas, apoyándose frecuentemente en señales acústicas tradicionales para anunciar su presencia. Su principal obstáculo radica en la ausencia de mecanismos tecnológicos que les permitan transmitir su ubicación actual o proyectar su ruta comercial.</w:t>
       </w:r>
     </w:p>
     <w:p>
@@ -313,7 +316,7 @@
         <w:pStyle w:val="NormasApa70"/>
       </w:pPr>
       <w:r>
-        <w:t>Esto genera una desconexión total con sus posibles clientes. Si una persona tiene el antojo de comprarles algo o necesita un producto que sabe que venden en la calle, se enfrenta a la gran dificultad de no poder ubicarlos. El comprador se queda sin forma de anticipar por dónde están transitando en ese preciso momento, obligándolo a salir a la calle a buscar a ciegas, asomarse a la puerta o simplemente quedarse esperando con la esperanza de cruzarse con ellos por pura suerte.</w:t>
+        <w:t>Esta carencia genera una desconexión operativa con sus clientes potenciales. Si un usuario desea adquirir sus productos, se enfrenta a la imposibilidad de localizarlos de manera predictiva. El comprador no tiene forma de anticipar la trayectoria del vendedor en un momento dado, viéndose obligado a realizar búsquedas físicas sin dirección clara o a esperar pasivamente una coincidencia fortuita en la vía pública.</w:t>
       </w:r>
     </w:p>
     <w:p>
@@ -321,9 +324,262 @@
         <w:pStyle w:val="NormasApa70"/>
       </w:pPr>
       <w:r>
-        <w:t>En consecuencia, las ventas de estos comerciantes quedan limitadas a las personas que, por simple casualidad, se cruzan en su camino o logran escuchar su llamado al pasar. Mientras tanto, a tan solo unas cuantas cuadras puede haber clientes con el dinero en la mano dispuestos a comprarles, pero que terminan rindiéndose y desistiendo de la compra, simplemente porque el vendedor ya dobló la esquina y no existe ninguna herramienta que permita rastrear su ubicación exacta para salir a su encuentro.</w:t>
+        <w:t>Como resultado, las transacciones de estos comerciantes itinerantes se limitan al tráfico peatonal incidental. Simultáneamente, a escasa distancia pueden existir consumidores dispuestos a realizar una compra, pero que desisten de la misma al no contar con una herramienta de rastreo que les permita ubicar con exactitud al vendedor antes de que este cambie de zona.</w:t>
       </w:r>
     </w:p>
+    <w:sdt>
+      <w:sdtPr>
+        <w:rPr>
+          <w:lang w:val="es-MX"/>
+        </w:rPr>
+        <w:id w:val="1249546430"/>
+        <w:docPartObj>
+          <w:docPartGallery w:val="Bibliographies"/>
+          <w:docPartUnique/>
+        </w:docPartObj>
+      </w:sdtPr>
+      <w:sdtEndPr>
+        <w:rPr>
+          <w:rFonts w:eastAsiaTheme="minorHAnsi" w:cs="Times New Roman"/>
+          <w:b w:val="0"/>
+          <w:sz w:val="22"/>
+          <w:szCs w:val="20"/>
+          <w:lang w:val="es-BO"/>
+        </w:rPr>
+      </w:sdtEndPr>
+      <w:sdtContent>
+        <w:p>
+          <w:pPr>
+            <w:pStyle w:val="Ttulo1"/>
+          </w:pPr>
+          <w:r>
+            <w:rPr>
+              <w:lang w:val="es-MX"/>
+            </w:rPr>
+            <w:t>Bibliografía</w:t>
+          </w:r>
+        </w:p>
+        <w:sdt>
+          <w:sdtPr>
+            <w:id w:val="111145805"/>
+            <w:bibliography/>
+          </w:sdtPr>
+          <w:sdtContent>
+            <w:p>
+              <w:pPr>
+                <w:pStyle w:val="Bibliografa"/>
+                <w:ind w:left="720" w:hanging="720"/>
+                <w:rPr>
+                  <w:noProof/>
+                  <w:kern w:val="0"/>
+                  <w:sz w:val="24"/>
+                  <w:szCs w:val="24"/>
+                  <w:lang w:val="en-US"/>
+                </w:rPr>
+              </w:pPr>
+              <w:r>
+                <w:fldChar w:fldCharType="begin"/>
+              </w:r>
+              <w:r>
+                <w:rPr>
+                  <w:lang w:val="en-US"/>
+                </w:rPr>
+                <w:instrText>BIBLIOGRAPHY</w:instrText>
+              </w:r>
+              <w:r>
+                <w:fldChar w:fldCharType="separate"/>
+              </w:r>
+              <w:r>
+                <w:rPr>
+                  <w:noProof/>
+                  <w:lang w:val="en-US"/>
+                </w:rPr>
+                <w:t xml:space="preserve">Google LLC. (2026). </w:t>
+              </w:r>
+              <w:r>
+                <w:rPr>
+                  <w:i/>
+                  <w:iCs/>
+                  <w:noProof/>
+                  <w:lang w:val="en-US"/>
+                </w:rPr>
+                <w:t>Google Maps</w:t>
+              </w:r>
+              <w:r>
+                <w:rPr>
+                  <w:noProof/>
+                  <w:lang w:val="en-US"/>
+                </w:rPr>
+                <w:t xml:space="preserve">. Google Play Store. </w:t>
+              </w:r>
+              <w:hyperlink r:id="rId6" w:tgtFrame="_blank" w:history="1">
+                <w:r>
+                  <w:rPr>
+                    <w:rStyle w:val="Hipervnculo"/>
+                    <w:noProof/>
+                    <w:lang w:val="en-US"/>
+                  </w:rPr>
+                  <w:t xml:space="preserve">https://www.google.com/maps </w:t>
+                </w:r>
+              </w:hyperlink>
+            </w:p>
+            <w:p>
+              <w:pPr>
+                <w:pStyle w:val="Bibliografa"/>
+                <w:ind w:left="720" w:hanging="720"/>
+                <w:rPr>
+                  <w:noProof/>
+                  <w:lang w:val="en-US"/>
+                </w:rPr>
+              </w:pPr>
+              <w:r>
+                <w:rPr>
+                  <w:noProof/>
+                  <w:lang w:val="es-MX"/>
+                </w:rPr>
+                <w:t xml:space="preserve">PedidosYa S.A. (2026). </w:t>
+              </w:r>
+              <w:r>
+                <w:rPr>
+                  <w:i/>
+                  <w:iCs/>
+                  <w:noProof/>
+                  <w:lang w:val="es-MX"/>
+                </w:rPr>
+                <w:t>PedidosYa - Delivery Online</w:t>
+              </w:r>
+              <w:r>
+                <w:rPr>
+                  <w:noProof/>
+                  <w:lang w:val="es-MX"/>
+                </w:rPr>
+                <w:t xml:space="preserve">. </w:t>
+              </w:r>
+              <w:r>
+                <w:rPr>
+                  <w:noProof/>
+                  <w:lang w:val="en-US"/>
+                </w:rPr>
+                <w:t xml:space="preserve">Google Play Store. </w:t>
+              </w:r>
+              <w:hyperlink r:id="rId7" w:tgtFrame="_blank" w:history="1">
+                <w:r>
+                  <w:rPr>
+                    <w:rStyle w:val="Hipervnculo"/>
+                    <w:noProof/>
+                    <w:lang w:val="en-US"/>
+                  </w:rPr>
+                  <w:t>https://play.google.com/store/apps/details?id=com.pedidosya&amp;hl=es_419</w:t>
+                </w:r>
+              </w:hyperlink>
+            </w:p>
+            <w:p>
+              <w:pPr>
+                <w:pStyle w:val="Bibliografa"/>
+                <w:ind w:left="720" w:hanging="720"/>
+                <w:rPr>
+                  <w:noProof/>
+                  <w:lang w:val="en-US"/>
+                </w:rPr>
+              </w:pPr>
+              <w:r>
+                <w:rPr>
+                  <w:noProof/>
+                  <w:lang w:val="en-US"/>
+                </w:rPr>
+                <w:t xml:space="preserve">Trufi Association. (2026). </w:t>
+              </w:r>
+              <w:r>
+                <w:rPr>
+                  <w:i/>
+                  <w:iCs/>
+                  <w:noProof/>
+                  <w:lang w:val="en-US"/>
+                </w:rPr>
+                <w:t>Trufi</w:t>
+              </w:r>
+              <w:r>
+                <w:rPr>
+                  <w:noProof/>
+                  <w:lang w:val="en-US"/>
+                </w:rPr>
+                <w:t xml:space="preserve">. Google Play Store. </w:t>
+              </w:r>
+              <w:hyperlink r:id="rId8" w:tgtFrame="_blank" w:history="1">
+                <w:r>
+                  <w:rPr>
+                    <w:rStyle w:val="Hipervnculo"/>
+                    <w:noProof/>
+                    <w:lang w:val="en-US"/>
+                  </w:rPr>
+                  <w:t>https://play.google.com/store/apps/details?id=app.trufi.navigator&amp;hl=es_419</w:t>
+                </w:r>
+              </w:hyperlink>
+            </w:p>
+            <w:p>
+              <w:pPr>
+                <w:pStyle w:val="Bibliografa"/>
+                <w:ind w:left="720" w:hanging="720"/>
+                <w:rPr>
+                  <w:noProof/>
+                  <w:lang w:val="es-MX"/>
+                </w:rPr>
+              </w:pPr>
+              <w:r>
+                <w:rPr>
+                  <w:noProof/>
+                  <w:lang w:val="en-US"/>
+                </w:rPr>
+                <w:t xml:space="preserve">Y Hub Zaf. </w:t>
+              </w:r>
+              <w:r>
+                <w:rPr>
+                  <w:noProof/>
+                  <w:lang w:val="es-MX"/>
+                </w:rPr>
+                <w:t xml:space="preserve">(2026). </w:t>
+              </w:r>
+              <w:r>
+                <w:rPr>
+                  <w:i/>
+                  <w:iCs/>
+                  <w:noProof/>
+                  <w:lang w:val="es-MX"/>
+                </w:rPr>
+                <w:t>Yango: viajes, comida y envíos</w:t>
+              </w:r>
+              <w:r>
+                <w:rPr>
+                  <w:noProof/>
+                  <w:lang w:val="es-MX"/>
+                </w:rPr>
+                <w:t xml:space="preserve">. Google Play Store. </w:t>
+              </w:r>
+              <w:hyperlink r:id="rId9" w:tgtFrame="_blank" w:history="1">
+                <w:r>
+                  <w:rPr>
+                    <w:rStyle w:val="Hipervnculo"/>
+                    <w:noProof/>
+                    <w:lang w:val="es-MX"/>
+                  </w:rPr>
+                  <w:t>https://play.google.com/store/apps/details?id=com.yandex.yango</w:t>
+                </w:r>
+              </w:hyperlink>
+            </w:p>
+            <w:p>
+              <w:r>
+                <w:rPr>
+                  <w:b/>
+                  <w:bCs/>
+                </w:rPr>
+                <w:fldChar w:fldCharType="end"/>
+              </w:r>
+            </w:p>
+          </w:sdtContent>
+        </w:sdt>
+      </w:sdtContent>
+    </w:sdt>
+    <w:p/>
     <w:sectPr>
       <w:pgSz w:w="11906" w:h="16838" w:code="9"/>
       <w:pgMar w:top="1440" w:right="1440" w:bottom="1440" w:left="1440" w:header="709" w:footer="709" w:gutter="0"/>
@@ -1300,18 +1556,19 @@
     <w:link w:val="Ttulo1Car"/>
     <w:uiPriority w:val="9"/>
     <w:qFormat/>
-    <w:rsid w:val="00040BA5"/>
+    <w:rsid w:val="008A2FC3"/>
     <w:pPr>
       <w:keepNext/>
       <w:keepLines/>
       <w:numPr>
         <w:numId w:val="2"/>
       </w:numPr>
-      <w:spacing w:before="360" w:after="80"/>
+      <w:spacing w:before="360" w:after="80" w:line="480" w:lineRule="auto"/>
       <w:outlineLvl w:val="0"/>
     </w:pPr>
     <w:rPr>
       <w:rFonts w:eastAsiaTheme="majorEastAsia" w:cstheme="majorBidi"/>
+      <w:b/>
       <w:sz w:val="24"/>
       <w:szCs w:val="40"/>
     </w:rPr>
@@ -1532,9 +1789,10 @@
     <w:basedOn w:val="Fuentedeprrafopredeter"/>
     <w:link w:val="Ttulo1"/>
     <w:uiPriority w:val="9"/>
-    <w:rsid w:val="00040BA5"/>
+    <w:rsid w:val="008A2FC3"/>
     <w:rPr>
       <w:rFonts w:eastAsiaTheme="majorEastAsia" w:cstheme="majorBidi"/>
+      <w:b/>
       <w:sz w:val="24"/>
       <w:szCs w:val="40"/>
     </w:rPr>
@@ -1924,10 +2182,9 @@
     <w:name w:val="Normas APA"/>
     <w:basedOn w:val="Ttulo1"/>
     <w:link w:val="NormasAPACar"/>
-    <w:qFormat/>
     <w:rsid w:val="005F0801"/>
     <w:rPr>
-      <w:b/>
+      <w:b w:val="0"/>
       <w:bCs/>
     </w:rPr>
   </w:style>
@@ -1938,7 +2195,7 @@
     <w:rsid w:val="005F0801"/>
     <w:rPr>
       <w:rFonts w:eastAsiaTheme="majorEastAsia" w:cstheme="majorBidi"/>
-      <w:b/>
+      <w:b w:val="0"/>
       <w:bCs/>
       <w:sz w:val="24"/>
       <w:szCs w:val="40"/>
@@ -1973,6 +2230,14 @@
     <w:rPr>
       <w:sz w:val="24"/>
     </w:rPr>
+  </w:style>
+  <w:style w:type="paragraph" w:styleId="Bibliografa">
+    <w:name w:val="Bibliography"/>
+    <w:basedOn w:val="Normal"/>
+    <w:next w:val="Normal"/>
+    <w:uiPriority w:val="37"/>
+    <w:unhideWhenUsed/>
+    <w:rsid w:val="008A2FC3"/>
   </w:style>
 </w:styles>
 </file>
@@ -2273,11 +2538,72 @@
 </file>
 
 <file path=customXml/item1.xml><?xml version="1.0" encoding="utf-8"?>
-<b:Sources xmlns:b="http://schemas.openxmlformats.org/officeDocument/2006/bibliography" xmlns="http://schemas.openxmlformats.org/officeDocument/2006/bibliography" SelectedStyle="\APASixthEditionOfficeOnline.xsl" StyleName="APA" Version="6"/>
+<b:Sources xmlns:b="http://schemas.openxmlformats.org/officeDocument/2006/bibliography" xmlns="http://schemas.openxmlformats.org/officeDocument/2006/bibliography" SelectedStyle="\APASeventhEdition.xsl" StyleName="APA" Version="7">
+  <b:Source>
+    <b:Tag>Goo26</b:Tag>
+    <b:SourceType>InternetSite</b:SourceType>
+    <b:Guid>{0C7C284A-26FC-4891-ACE8-54479867FD2D}</b:Guid>
+    <b:Author>
+      <b:Author>
+        <b:Corporate>Google LLC</b:Corporate>
+      </b:Author>
+    </b:Author>
+    <b:Title>Google Maps</b:Title>
+    <b:InternetSiteTitle>Google Play Store</b:InternetSiteTitle>
+    <b:Year>2026</b:Year>
+    <b:URL>https://www.google.com/maps  </b:URL>
+    <b:RefOrder>1</b:RefOrder>
+  </b:Source>
+  <b:Source>
+    <b:Tag>Tru26</b:Tag>
+    <b:SourceType>InternetSite</b:SourceType>
+    <b:Guid>{F5D8978C-6B50-435C-A45E-0C73FE4459E0}</b:Guid>
+    <b:Author>
+      <b:Author>
+        <b:Corporate>Trufi Association</b:Corporate>
+      </b:Author>
+    </b:Author>
+    <b:Title>Trufi</b:Title>
+    <b:InternetSiteTitle>Google Play Store</b:InternetSiteTitle>
+    <b:Year>2026</b:Year>
+    <b:URL>https://play.google.com/store/apps/details?id=app.trufi.navigator&amp;hl=es_419</b:URL>
+    <b:RefOrder>4</b:RefOrder>
+  </b:Source>
+  <b:Source>
+    <b:Tag>YHu26</b:Tag>
+    <b:SourceType>InternetSite</b:SourceType>
+    <b:Guid>{AD25DD2C-57A5-4A9A-9F6F-679A7BED7B56}</b:Guid>
+    <b:Author>
+      <b:Author>
+        <b:Corporate>Y Hub Zaf</b:Corporate>
+      </b:Author>
+    </b:Author>
+    <b:Title>Yango: viajes, comida y envíos</b:Title>
+    <b:InternetSiteTitle>Google Play Store</b:InternetSiteTitle>
+    <b:Year>2026</b:Year>
+    <b:URL>https://play.google.com/store/apps/details?id=com.yandex.yango</b:URL>
+    <b:RefOrder>3</b:RefOrder>
+  </b:Source>
+  <b:Source>
+    <b:Tag>Ped26</b:Tag>
+    <b:SourceType>InternetSite</b:SourceType>
+    <b:Guid>{4FBDE315-CA87-446D-94E4-233FA5D53EEC}</b:Guid>
+    <b:Author>
+      <b:Author>
+        <b:Corporate>PedidosYa S.A</b:Corporate>
+      </b:Author>
+    </b:Author>
+    <b:Title>PedidosYa - Delivery Online</b:Title>
+    <b:InternetSiteTitle>Google Play Store</b:InternetSiteTitle>
+    <b:Year>2026</b:Year>
+    <b:URL>https://play.google.com/store/apps/details?id=com.pedidosya&amp;hl=es_419</b:URL>
+    <b:RefOrder>2</b:RefOrder>
+  </b:Source>
+</b:Sources>
 </file>
 
 <file path=customXml/itemProps1.xml><?xml version="1.0" encoding="utf-8"?>
-<ds:datastoreItem xmlns:ds="http://schemas.openxmlformats.org/officeDocument/2006/customXml" ds:itemID="{8A5D267D-563C-4D61-8933-5C04DAA1F63C}">
+<ds:datastoreItem xmlns:ds="http://schemas.openxmlformats.org/officeDocument/2006/customXml" ds:itemID="{23FDB2F0-99BA-4472-A18B-A842864F9DBE}">
   <ds:schemaRefs>
     <ds:schemaRef ds:uri="http://schemas.openxmlformats.org/officeDocument/2006/bibliography"/>
   </ds:schemaRefs>

</xml_diff>

<commit_message>
add: Problem definition, and general and specific objectives.
</commit_message>
<xml_diff>
--- a/Perfil de grado.docx
+++ b/Perfil de grado.docx
@@ -129,10 +129,7 @@
         <w:pStyle w:val="NormasApa70"/>
       </w:pPr>
       <w:r>
-        <w:t>Yango, que desde su llegada a la ciudad permite el servicio de transporte de pasajeros, logística y envío de paquetería a través de su aplicación móvil disponible para iOS y Android, que ofrece un servicio de movilidad urbana basado en la geolocalización y el seguimiento de vehículos en tiempo real.</w:t>
-      </w:r>
-      <w:r>
-        <w:t xml:space="preserve"> </w:t>
+        <w:t xml:space="preserve">Yango, que desde su llegada a la ciudad permite el servicio de transporte de pasajeros, logística y envío de paquetería a través de su aplicación móvil disponible para iOS y Android, que ofrece un servicio de movilidad urbana basado en la geolocalización y el seguimiento de vehículos en tiempo real. </w:t>
       </w:r>
       <w:sdt>
         <w:sdtPr>
@@ -213,11 +210,11 @@
         <w:pStyle w:val="NormasApa70"/>
       </w:pPr>
       <w:r>
-        <w:t xml:space="preserve">Cuando una persona busca un lugar para comer en la ciudad de Cercado, frecuentemente, por limitaciones de tiempo o para minimizar el esfuerzo de búsqueda, termina optando por el primer establecimiento disponible. Al hacerlo, omite alternativas cercanas que podrían ofrecer una mejor relación calidad-precio o valoraciones superiores. Esta situación se acentúa en individuos no residentes que, al desconocer la zona, ingresan a un local sin </w:t>
+        <w:t xml:space="preserve">Cuando una persona busca un lugar para comer en la ciudad de Cercado, frecuentemente, por limitaciones de tiempo o para minimizar el esfuerzo de búsqueda, termina optando por el primer establecimiento disponible. Al hacerlo, omite alternativas cercanas que podrían ofrecer una mejor relación calidad-precio o valoraciones superiores. Esta situación se acentúa en individuos no residentes que, al desconocer la zona, ingresan a un local sin información previa </w:t>
       </w:r>
       <w:r>
         <w:lastRenderedPageBreak/>
-        <w:t>información previa sobre los costos o la calidad del servicio. Asimismo, cuando existe la intención de consumir un plato en específico, encontrar el establecimiento adecuado que lo ofrezca y que cuente con recomendaciones confiables resulta ser una tarea compleja.</w:t>
+        <w:t>sobre los costos o la calidad del servicio. Asimismo, cuando existe la intención de consumir un plato en específico, encontrar el establecimiento adecuado que lo ofrezca y que cuente con recomendaciones confiables resulta ser una tarea compleja.</w:t>
       </w:r>
     </w:p>
     <w:p>
@@ -325,11 +322,207 @@
       </w:pPr>
       <w:r>
         <w:t>Como resultado, las transacciones de estos comerciantes itinerantes se limitan al tráfico peatonal incidental. Simultáneamente, a escasa distancia pueden existir consumidores dispuestos a realizar una compra, pero que desisten de la misma al no contar con una herramienta de rastreo que les permita ubicar con exactitud al vendedor antes de que este cambie de zona.</w:t>
+      </w:r>
+    </w:p>
+    <w:p>
+      <w:pPr>
+        <w:pStyle w:val="Ttulo1"/>
+      </w:pPr>
+      <w:r>
+        <w:t>Definición del problema</w:t>
+      </w:r>
+    </w:p>
+    <w:p>
+      <w:pPr>
+        <w:pStyle w:val="NormasApa70"/>
+      </w:pPr>
+      <w:r>
+        <w:t xml:space="preserve">¿En qué medida un sistema de geolocalización en tiempo real puede transformar la manera en que los habitantes y visitantes de </w:t>
+      </w:r>
+      <w:r>
+        <w:t xml:space="preserve">la provincia de Cercado </w:t>
+      </w:r>
+      <w:r>
+        <w:t>buscan productos y comida, resolviendo la incertidumbre, ineficiencia y fragmentación de información sobre disponibilidad</w:t>
+      </w:r>
+      <w:r>
+        <w:t xml:space="preserve">, </w:t>
+      </w:r>
+      <w:r>
+        <w:t>ubicación</w:t>
+      </w:r>
+      <w:r>
+        <w:t>, precios, horarios de atención y rutas óptimas de acceso en la ciudad?</w:t>
+      </w:r>
+    </w:p>
+    <w:p>
+      <w:pPr>
+        <w:pStyle w:val="Ttulo1"/>
+      </w:pPr>
+      <w:r>
+        <w:t>Objetivo</w:t>
+      </w:r>
+      <w:r>
+        <w:t>s</w:t>
+      </w:r>
+    </w:p>
+    <w:p>
+      <w:pPr>
+        <w:pStyle w:val="Ttulo2"/>
+      </w:pPr>
+      <w:r>
+        <w:t>Objetivo General</w:t>
+      </w:r>
+    </w:p>
+    <w:p>
+      <w:pPr>
+        <w:pStyle w:val="NormasApa70"/>
+      </w:pPr>
+      <w:r>
+        <w:t>Desarrollar</w:t>
+      </w:r>
+      <w:r>
+        <w:t xml:space="preserve"> una plataforma móvil de geolocalización en tiempo real que permita a los habitantes y visitantes de la provincia de Cercado buscar productos y comida, visualizando la disponibilidad, ubicación, precios, horarios de atención y rutas óptimas de acceso de los distintos comercios fijos y ambulantes, con el fin de reducir la incertidumbre, ineficiencia y fragmentación de información que actualmente afectan sus decisiones de compra y desplazamiento.</w:t>
+      </w:r>
+    </w:p>
+    <w:p>
+      <w:pPr>
+        <w:pStyle w:val="Ttulo2"/>
+      </w:pPr>
+      <w:r>
+        <w:t>Objetivos específicos</w:t>
+      </w:r>
+    </w:p>
+    <w:p>
+      <w:pPr>
+        <w:pStyle w:val="NormasApa70"/>
+        <w:numPr>
+          <w:ilvl w:val="0"/>
+          <w:numId w:val="8"/>
+        </w:numPr>
+        <w:rPr>
+          <w:lang w:eastAsia="es-BO"/>
+        </w:rPr>
+      </w:pPr>
+      <w:r>
+        <w:rPr>
+          <w:lang w:eastAsia="es-BO"/>
+        </w:rPr>
+        <w:t xml:space="preserve">Diseñar un mapa interactivo que permita el registro y visualización de comercios fijos (tiendas, restaurantes y pequeños negocios) con su ubicación exacta dentro de la provincia de Cercado. </w:t>
+      </w:r>
+    </w:p>
+    <w:p>
+      <w:pPr>
+        <w:pStyle w:val="NormasApa70"/>
+        <w:numPr>
+          <w:ilvl w:val="0"/>
+          <w:numId w:val="8"/>
+        </w:numPr>
+        <w:rPr>
+          <w:lang w:eastAsia="es-BO"/>
+        </w:rPr>
+      </w:pPr>
+      <w:r>
+        <w:rPr>
+          <w:lang w:eastAsia="es-BO"/>
+        </w:rPr>
+        <w:t xml:space="preserve">Implementar un módulo de estado en tiempo real que muestre a los usuarios si un comercio se encuentra abierto o cerrado, junto con la disponibilidad actualizada de su inventario o menú. </w:t>
+      </w:r>
+    </w:p>
+    <w:p>
+      <w:pPr>
+        <w:pStyle w:val="NormasApa70"/>
+        <w:numPr>
+          <w:ilvl w:val="0"/>
+          <w:numId w:val="8"/>
+        </w:numPr>
+        <w:rPr>
+          <w:lang w:eastAsia="es-BO"/>
+        </w:rPr>
+      </w:pPr>
+      <w:r>
+        <w:rPr>
+          <w:lang w:eastAsia="es-BO"/>
+        </w:rPr>
+        <w:t xml:space="preserve">Desarrollar una funcionalidad de geolocalización en tiempo real para comerciantes ambulantes, que les permita transmitir su ubicación actual y proyectar su recorrido a los usuarios interesados. </w:t>
+      </w:r>
+    </w:p>
+    <w:p>
+      <w:pPr>
+        <w:pStyle w:val="NormasApa70"/>
+        <w:numPr>
+          <w:ilvl w:val="0"/>
+          <w:numId w:val="8"/>
+        </w:numPr>
+        <w:rPr>
+          <w:lang w:eastAsia="es-BO"/>
+        </w:rPr>
+      </w:pPr>
+      <w:r>
+        <w:rPr>
+          <w:lang w:eastAsia="es-BO"/>
+        </w:rPr>
+        <w:t xml:space="preserve">Integrar información sobre las líneas de transporte público disponibles, que indique al usuario la ruta y el medio óptimo (peatonal o vehicular) para llegar a su destino. </w:t>
+      </w:r>
+    </w:p>
+    <w:p>
+      <w:pPr>
+        <w:pStyle w:val="NormasApa70"/>
+        <w:numPr>
+          <w:ilvl w:val="0"/>
+          <w:numId w:val="8"/>
+        </w:numPr>
+        <w:rPr>
+          <w:lang w:eastAsia="es-BO"/>
+        </w:rPr>
+      </w:pPr>
+      <w:r>
+        <w:rPr>
+          <w:lang w:eastAsia="es-BO"/>
+        </w:rPr>
+        <w:t xml:space="preserve">Diseñar un sistema de carrito o lista de productos que permita al usuario planificar sus compras y visualizar el trayecto necesario para adquirirlos. </w:t>
+      </w:r>
+    </w:p>
+    <w:p>
+      <w:pPr>
+        <w:pStyle w:val="NormasApa70"/>
+        <w:numPr>
+          <w:ilvl w:val="0"/>
+          <w:numId w:val="8"/>
+        </w:numPr>
+        <w:rPr>
+          <w:lang w:eastAsia="es-BO"/>
+        </w:rPr>
+      </w:pPr>
+      <w:r>
+        <w:rPr>
+          <w:lang w:eastAsia="es-BO"/>
+        </w:rPr>
+        <w:t xml:space="preserve">Implementar un módulo de comparación de precios entre los distintos comercios registrados, que facilite al usuario identificar la mejor oferta disponible según su ubicación. </w:t>
+      </w:r>
+    </w:p>
+    <w:p>
+      <w:pPr>
+        <w:pStyle w:val="NormasApa70"/>
+        <w:numPr>
+          <w:ilvl w:val="0"/>
+          <w:numId w:val="8"/>
+        </w:numPr>
+      </w:pPr>
+      <w:r>
+        <w:rPr>
+          <w:lang w:eastAsia="es-BO"/>
+        </w:rPr>
+        <w:t>Desarrollar un sistema de búsqueda de productos y platillos específicos que muestre al usuario los puntos de venta más cercanos que los ofrecen.</w:t>
       </w:r>
     </w:p>
     <w:sdt>
       <w:sdtPr>
         <w:rPr>
+          <w:rFonts w:eastAsiaTheme="minorHAnsi" w:cs="Times New Roman"/>
+          <w:b w:val="0"/>
+          <w:sz w:val="22"/>
+          <w:szCs w:val="20"/>
           <w:lang w:val="es-MX"/>
         </w:rPr>
         <w:id w:val="1249546430"/>
@@ -340,10 +533,6 @@
       </w:sdtPr>
       <w:sdtEndPr>
         <w:rPr>
-          <w:rFonts w:eastAsiaTheme="minorHAnsi" w:cs="Times New Roman"/>
-          <w:b w:val="0"/>
-          <w:sz w:val="22"/>
-          <w:szCs w:val="20"/>
           <w:lang w:val="es-BO"/>
         </w:rPr>
       </w:sdtEndPr>
@@ -581,7 +770,7 @@
     </w:sdt>
     <w:p/>
     <w:sectPr>
-      <w:pgSz w:w="11906" w:h="16838" w:code="9"/>
+      <w:pgSz w:w="12240" w:h="15840" w:code="1"/>
       <w:pgMar w:top="1440" w:right="1440" w:bottom="1440" w:left="1440" w:header="709" w:footer="709" w:gutter="0"/>
       <w:cols w:space="708"/>
       <w:docGrid w:linePitch="360"/>
@@ -903,6 +1092,232 @@
     </w:lvl>
   </w:abstractNum>
   <w:abstractNum w:abstractNumId="3" w15:restartNumberingAfterBreak="0">
+    <w:nsid w:val="412728DA"/>
+    <w:multiLevelType w:val="hybridMultilevel"/>
+    <w:tmpl w:val="F4CE05A2"/>
+    <w:lvl w:ilvl="0" w:tplc="400A0001">
+      <w:start w:val="1"/>
+      <w:numFmt w:val="bullet"/>
+      <w:lvlText w:val=""/>
+      <w:lvlJc w:val="left"/>
+      <w:pPr>
+        <w:ind w:left="720" w:hanging="360"/>
+      </w:pPr>
+      <w:rPr>
+        <w:rFonts w:ascii="Symbol" w:hAnsi="Symbol" w:hint="default"/>
+      </w:rPr>
+    </w:lvl>
+    <w:lvl w:ilvl="1" w:tplc="400A0003" w:tentative="1">
+      <w:start w:val="1"/>
+      <w:numFmt w:val="bullet"/>
+      <w:lvlText w:val="o"/>
+      <w:lvlJc w:val="left"/>
+      <w:pPr>
+        <w:ind w:left="1440" w:hanging="360"/>
+      </w:pPr>
+      <w:rPr>
+        <w:rFonts w:ascii="Courier New" w:hAnsi="Courier New" w:cs="Courier New" w:hint="default"/>
+      </w:rPr>
+    </w:lvl>
+    <w:lvl w:ilvl="2" w:tplc="400A0005" w:tentative="1">
+      <w:start w:val="1"/>
+      <w:numFmt w:val="bullet"/>
+      <w:lvlText w:val=""/>
+      <w:lvlJc w:val="left"/>
+      <w:pPr>
+        <w:ind w:left="2160" w:hanging="360"/>
+      </w:pPr>
+      <w:rPr>
+        <w:rFonts w:ascii="Wingdings" w:hAnsi="Wingdings" w:hint="default"/>
+      </w:rPr>
+    </w:lvl>
+    <w:lvl w:ilvl="3" w:tplc="400A0001" w:tentative="1">
+      <w:start w:val="1"/>
+      <w:numFmt w:val="bullet"/>
+      <w:lvlText w:val=""/>
+      <w:lvlJc w:val="left"/>
+      <w:pPr>
+        <w:ind w:left="2880" w:hanging="360"/>
+      </w:pPr>
+      <w:rPr>
+        <w:rFonts w:ascii="Symbol" w:hAnsi="Symbol" w:hint="default"/>
+      </w:rPr>
+    </w:lvl>
+    <w:lvl w:ilvl="4" w:tplc="400A0003" w:tentative="1">
+      <w:start w:val="1"/>
+      <w:numFmt w:val="bullet"/>
+      <w:lvlText w:val="o"/>
+      <w:lvlJc w:val="left"/>
+      <w:pPr>
+        <w:ind w:left="3600" w:hanging="360"/>
+      </w:pPr>
+      <w:rPr>
+        <w:rFonts w:ascii="Courier New" w:hAnsi="Courier New" w:cs="Courier New" w:hint="default"/>
+      </w:rPr>
+    </w:lvl>
+    <w:lvl w:ilvl="5" w:tplc="400A0005" w:tentative="1">
+      <w:start w:val="1"/>
+      <w:numFmt w:val="bullet"/>
+      <w:lvlText w:val=""/>
+      <w:lvlJc w:val="left"/>
+      <w:pPr>
+        <w:ind w:left="4320" w:hanging="360"/>
+      </w:pPr>
+      <w:rPr>
+        <w:rFonts w:ascii="Wingdings" w:hAnsi="Wingdings" w:hint="default"/>
+      </w:rPr>
+    </w:lvl>
+    <w:lvl w:ilvl="6" w:tplc="400A0001" w:tentative="1">
+      <w:start w:val="1"/>
+      <w:numFmt w:val="bullet"/>
+      <w:lvlText w:val=""/>
+      <w:lvlJc w:val="left"/>
+      <w:pPr>
+        <w:ind w:left="5040" w:hanging="360"/>
+      </w:pPr>
+      <w:rPr>
+        <w:rFonts w:ascii="Symbol" w:hAnsi="Symbol" w:hint="default"/>
+      </w:rPr>
+    </w:lvl>
+    <w:lvl w:ilvl="7" w:tplc="400A0003" w:tentative="1">
+      <w:start w:val="1"/>
+      <w:numFmt w:val="bullet"/>
+      <w:lvlText w:val="o"/>
+      <w:lvlJc w:val="left"/>
+      <w:pPr>
+        <w:ind w:left="5760" w:hanging="360"/>
+      </w:pPr>
+      <w:rPr>
+        <w:rFonts w:ascii="Courier New" w:hAnsi="Courier New" w:cs="Courier New" w:hint="default"/>
+      </w:rPr>
+    </w:lvl>
+    <w:lvl w:ilvl="8" w:tplc="400A0005" w:tentative="1">
+      <w:start w:val="1"/>
+      <w:numFmt w:val="bullet"/>
+      <w:lvlText w:val=""/>
+      <w:lvlJc w:val="left"/>
+      <w:pPr>
+        <w:ind w:left="6480" w:hanging="360"/>
+      </w:pPr>
+      <w:rPr>
+        <w:rFonts w:ascii="Wingdings" w:hAnsi="Wingdings" w:hint="default"/>
+      </w:rPr>
+    </w:lvl>
+  </w:abstractNum>
+  <w:abstractNum w:abstractNumId="4" w15:restartNumberingAfterBreak="0">
+    <w:nsid w:val="41B1573E"/>
+    <w:multiLevelType w:val="hybridMultilevel"/>
+    <w:tmpl w:val="61E4EC20"/>
+    <w:lvl w:ilvl="0" w:tplc="400A0001">
+      <w:start w:val="1"/>
+      <w:numFmt w:val="bullet"/>
+      <w:lvlText w:val=""/>
+      <w:lvlJc w:val="left"/>
+      <w:pPr>
+        <w:ind w:left="1440" w:hanging="360"/>
+      </w:pPr>
+      <w:rPr>
+        <w:rFonts w:ascii="Symbol" w:hAnsi="Symbol" w:hint="default"/>
+      </w:rPr>
+    </w:lvl>
+    <w:lvl w:ilvl="1" w:tplc="400A0003" w:tentative="1">
+      <w:start w:val="1"/>
+      <w:numFmt w:val="bullet"/>
+      <w:lvlText w:val="o"/>
+      <w:lvlJc w:val="left"/>
+      <w:pPr>
+        <w:ind w:left="2160" w:hanging="360"/>
+      </w:pPr>
+      <w:rPr>
+        <w:rFonts w:ascii="Courier New" w:hAnsi="Courier New" w:cs="Courier New" w:hint="default"/>
+      </w:rPr>
+    </w:lvl>
+    <w:lvl w:ilvl="2" w:tplc="400A0005" w:tentative="1">
+      <w:start w:val="1"/>
+      <w:numFmt w:val="bullet"/>
+      <w:lvlText w:val=""/>
+      <w:lvlJc w:val="left"/>
+      <w:pPr>
+        <w:ind w:left="2880" w:hanging="360"/>
+      </w:pPr>
+      <w:rPr>
+        <w:rFonts w:ascii="Wingdings" w:hAnsi="Wingdings" w:hint="default"/>
+      </w:rPr>
+    </w:lvl>
+    <w:lvl w:ilvl="3" w:tplc="400A0001" w:tentative="1">
+      <w:start w:val="1"/>
+      <w:numFmt w:val="bullet"/>
+      <w:lvlText w:val=""/>
+      <w:lvlJc w:val="left"/>
+      <w:pPr>
+        <w:ind w:left="3600" w:hanging="360"/>
+      </w:pPr>
+      <w:rPr>
+        <w:rFonts w:ascii="Symbol" w:hAnsi="Symbol" w:hint="default"/>
+      </w:rPr>
+    </w:lvl>
+    <w:lvl w:ilvl="4" w:tplc="400A0003" w:tentative="1">
+      <w:start w:val="1"/>
+      <w:numFmt w:val="bullet"/>
+      <w:lvlText w:val="o"/>
+      <w:lvlJc w:val="left"/>
+      <w:pPr>
+        <w:ind w:left="4320" w:hanging="360"/>
+      </w:pPr>
+      <w:rPr>
+        <w:rFonts w:ascii="Courier New" w:hAnsi="Courier New" w:cs="Courier New" w:hint="default"/>
+      </w:rPr>
+    </w:lvl>
+    <w:lvl w:ilvl="5" w:tplc="400A0005" w:tentative="1">
+      <w:start w:val="1"/>
+      <w:numFmt w:val="bullet"/>
+      <w:lvlText w:val=""/>
+      <w:lvlJc w:val="left"/>
+      <w:pPr>
+        <w:ind w:left="5040" w:hanging="360"/>
+      </w:pPr>
+      <w:rPr>
+        <w:rFonts w:ascii="Wingdings" w:hAnsi="Wingdings" w:hint="default"/>
+      </w:rPr>
+    </w:lvl>
+    <w:lvl w:ilvl="6" w:tplc="400A0001" w:tentative="1">
+      <w:start w:val="1"/>
+      <w:numFmt w:val="bullet"/>
+      <w:lvlText w:val=""/>
+      <w:lvlJc w:val="left"/>
+      <w:pPr>
+        <w:ind w:left="5760" w:hanging="360"/>
+      </w:pPr>
+      <w:rPr>
+        <w:rFonts w:ascii="Symbol" w:hAnsi="Symbol" w:hint="default"/>
+      </w:rPr>
+    </w:lvl>
+    <w:lvl w:ilvl="7" w:tplc="400A0003" w:tentative="1">
+      <w:start w:val="1"/>
+      <w:numFmt w:val="bullet"/>
+      <w:lvlText w:val="o"/>
+      <w:lvlJc w:val="left"/>
+      <w:pPr>
+        <w:ind w:left="6480" w:hanging="360"/>
+      </w:pPr>
+      <w:rPr>
+        <w:rFonts w:ascii="Courier New" w:hAnsi="Courier New" w:cs="Courier New" w:hint="default"/>
+      </w:rPr>
+    </w:lvl>
+    <w:lvl w:ilvl="8" w:tplc="400A0005" w:tentative="1">
+      <w:start w:val="1"/>
+      <w:numFmt w:val="bullet"/>
+      <w:lvlText w:val=""/>
+      <w:lvlJc w:val="left"/>
+      <w:pPr>
+        <w:ind w:left="7200" w:hanging="360"/>
+      </w:pPr>
+      <w:rPr>
+        <w:rFonts w:ascii="Wingdings" w:hAnsi="Wingdings" w:hint="default"/>
+      </w:rPr>
+    </w:lvl>
+  </w:abstractNum>
+  <w:abstractNum w:abstractNumId="5" w15:restartNumberingAfterBreak="0">
     <w:nsid w:val="43ED2013"/>
     <w:multiLevelType w:val="multilevel"/>
     <w:tmpl w:val="4DBA6494"/>
@@ -1020,7 +1435,119 @@
       </w:rPr>
     </w:lvl>
   </w:abstractNum>
-  <w:abstractNum w:abstractNumId="4" w15:restartNumberingAfterBreak="0">
+  <w:abstractNum w:abstractNumId="6" w15:restartNumberingAfterBreak="0">
+    <w:nsid w:val="730A158C"/>
+    <w:multiLevelType w:val="hybridMultilevel"/>
+    <w:tmpl w:val="1D5CC33E"/>
+    <w:lvl w:ilvl="0" w:tplc="C9F66982">
+      <w:numFmt w:val="bullet"/>
+      <w:lvlText w:val=""/>
+      <w:lvlJc w:val="left"/>
+      <w:pPr>
+        <w:ind w:left="1080" w:hanging="360"/>
+      </w:pPr>
+      <w:rPr>
+        <w:rFonts w:ascii="Symbol" w:eastAsiaTheme="minorHAnsi" w:hAnsi="Symbol" w:cs="Times New Roman" w:hint="default"/>
+      </w:rPr>
+    </w:lvl>
+    <w:lvl w:ilvl="1" w:tplc="400A0003" w:tentative="1">
+      <w:start w:val="1"/>
+      <w:numFmt w:val="bullet"/>
+      <w:lvlText w:val="o"/>
+      <w:lvlJc w:val="left"/>
+      <w:pPr>
+        <w:ind w:left="1800" w:hanging="360"/>
+      </w:pPr>
+      <w:rPr>
+        <w:rFonts w:ascii="Courier New" w:hAnsi="Courier New" w:cs="Courier New" w:hint="default"/>
+      </w:rPr>
+    </w:lvl>
+    <w:lvl w:ilvl="2" w:tplc="400A0005" w:tentative="1">
+      <w:start w:val="1"/>
+      <w:numFmt w:val="bullet"/>
+      <w:lvlText w:val=""/>
+      <w:lvlJc w:val="left"/>
+      <w:pPr>
+        <w:ind w:left="2520" w:hanging="360"/>
+      </w:pPr>
+      <w:rPr>
+        <w:rFonts w:ascii="Wingdings" w:hAnsi="Wingdings" w:hint="default"/>
+      </w:rPr>
+    </w:lvl>
+    <w:lvl w:ilvl="3" w:tplc="400A0001" w:tentative="1">
+      <w:start w:val="1"/>
+      <w:numFmt w:val="bullet"/>
+      <w:lvlText w:val=""/>
+      <w:lvlJc w:val="left"/>
+      <w:pPr>
+        <w:ind w:left="3240" w:hanging="360"/>
+      </w:pPr>
+      <w:rPr>
+        <w:rFonts w:ascii="Symbol" w:hAnsi="Symbol" w:hint="default"/>
+      </w:rPr>
+    </w:lvl>
+    <w:lvl w:ilvl="4" w:tplc="400A0003" w:tentative="1">
+      <w:start w:val="1"/>
+      <w:numFmt w:val="bullet"/>
+      <w:lvlText w:val="o"/>
+      <w:lvlJc w:val="left"/>
+      <w:pPr>
+        <w:ind w:left="3960" w:hanging="360"/>
+      </w:pPr>
+      <w:rPr>
+        <w:rFonts w:ascii="Courier New" w:hAnsi="Courier New" w:cs="Courier New" w:hint="default"/>
+      </w:rPr>
+    </w:lvl>
+    <w:lvl w:ilvl="5" w:tplc="400A0005" w:tentative="1">
+      <w:start w:val="1"/>
+      <w:numFmt w:val="bullet"/>
+      <w:lvlText w:val=""/>
+      <w:lvlJc w:val="left"/>
+      <w:pPr>
+        <w:ind w:left="4680" w:hanging="360"/>
+      </w:pPr>
+      <w:rPr>
+        <w:rFonts w:ascii="Wingdings" w:hAnsi="Wingdings" w:hint="default"/>
+      </w:rPr>
+    </w:lvl>
+    <w:lvl w:ilvl="6" w:tplc="400A0001" w:tentative="1">
+      <w:start w:val="1"/>
+      <w:numFmt w:val="bullet"/>
+      <w:lvlText w:val=""/>
+      <w:lvlJc w:val="left"/>
+      <w:pPr>
+        <w:ind w:left="5400" w:hanging="360"/>
+      </w:pPr>
+      <w:rPr>
+        <w:rFonts w:ascii="Symbol" w:hAnsi="Symbol" w:hint="default"/>
+      </w:rPr>
+    </w:lvl>
+    <w:lvl w:ilvl="7" w:tplc="400A0003" w:tentative="1">
+      <w:start w:val="1"/>
+      <w:numFmt w:val="bullet"/>
+      <w:lvlText w:val="o"/>
+      <w:lvlJc w:val="left"/>
+      <w:pPr>
+        <w:ind w:left="6120" w:hanging="360"/>
+      </w:pPr>
+      <w:rPr>
+        <w:rFonts w:ascii="Courier New" w:hAnsi="Courier New" w:cs="Courier New" w:hint="default"/>
+      </w:rPr>
+    </w:lvl>
+    <w:lvl w:ilvl="8" w:tplc="400A0005" w:tentative="1">
+      <w:start w:val="1"/>
+      <w:numFmt w:val="bullet"/>
+      <w:lvlText w:val=""/>
+      <w:lvlJc w:val="left"/>
+      <w:pPr>
+        <w:ind w:left="6840" w:hanging="360"/>
+      </w:pPr>
+      <w:rPr>
+        <w:rFonts w:ascii="Wingdings" w:hAnsi="Wingdings" w:hint="default"/>
+      </w:rPr>
+    </w:lvl>
+  </w:abstractNum>
+  <w:abstractNum w:abstractNumId="7" w15:restartNumberingAfterBreak="0">
     <w:nsid w:val="7DBA27FA"/>
     <w:multiLevelType w:val="hybridMultilevel"/>
     <w:tmpl w:val="B9FC92FA"/>
@@ -1136,7 +1663,7 @@
     <w:abstractNumId w:val="1"/>
   </w:num>
   <w:num w:numId="2" w16cid:durableId="1509517816">
-    <w:abstractNumId w:val="3"/>
+    <w:abstractNumId w:val="5"/>
   </w:num>
   <w:num w:numId="3" w16cid:durableId="1035620757">
     <w:abstractNumId w:val="0"/>
@@ -1145,7 +1672,16 @@
     <w:abstractNumId w:val="2"/>
   </w:num>
   <w:num w:numId="5" w16cid:durableId="1767992695">
+    <w:abstractNumId w:val="7"/>
+  </w:num>
+  <w:num w:numId="6" w16cid:durableId="1242326651">
+    <w:abstractNumId w:val="3"/>
+  </w:num>
+  <w:num w:numId="7" w16cid:durableId="1197500053">
     <w:abstractNumId w:val="4"/>
+  </w:num>
+  <w:num w:numId="8" w16cid:durableId="835878832">
+    <w:abstractNumId w:val="6"/>
   </w:num>
 </w:numbering>
 </file>
@@ -1556,14 +2092,15 @@
     <w:link w:val="Ttulo1Car"/>
     <w:uiPriority w:val="9"/>
     <w:qFormat/>
-    <w:rsid w:val="008A2FC3"/>
+    <w:rsid w:val="00351892"/>
     <w:pPr>
       <w:keepNext/>
       <w:keepLines/>
       <w:numPr>
         <w:numId w:val="2"/>
       </w:numPr>
-      <w:spacing w:before="360" w:after="80" w:line="480" w:lineRule="auto"/>
+      <w:spacing w:after="0" w:line="480" w:lineRule="auto"/>
+      <w:ind w:left="0" w:firstLine="0"/>
       <w:outlineLvl w:val="0"/>
     </w:pPr>
     <w:rPr>
@@ -1579,10 +2116,9 @@
     <w:next w:val="Normal"/>
     <w:link w:val="Ttulo2Car"/>
     <w:uiPriority w:val="9"/>
-    <w:semiHidden/>
     <w:unhideWhenUsed/>
     <w:qFormat/>
-    <w:rsid w:val="00040BA5"/>
+    <w:rsid w:val="00351892"/>
     <w:pPr>
       <w:keepNext/>
       <w:keepLines/>
@@ -1590,11 +2126,13 @@
         <w:ilvl w:val="1"/>
         <w:numId w:val="2"/>
       </w:numPr>
-      <w:spacing w:before="160" w:after="80"/>
+      <w:spacing w:after="0" w:line="480" w:lineRule="auto"/>
+      <w:ind w:left="0" w:firstLine="0"/>
       <w:outlineLvl w:val="1"/>
     </w:pPr>
     <w:rPr>
       <w:rFonts w:eastAsiaTheme="majorEastAsia" w:cstheme="majorBidi"/>
+      <w:b/>
       <w:sz w:val="24"/>
       <w:szCs w:val="32"/>
     </w:rPr>
@@ -1789,7 +2327,7 @@
     <w:basedOn w:val="Fuentedeprrafopredeter"/>
     <w:link w:val="Ttulo1"/>
     <w:uiPriority w:val="9"/>
-    <w:rsid w:val="008A2FC3"/>
+    <w:rsid w:val="00351892"/>
     <w:rPr>
       <w:rFonts w:eastAsiaTheme="majorEastAsia" w:cstheme="majorBidi"/>
       <w:b/>
@@ -1802,10 +2340,10 @@
     <w:basedOn w:val="Fuentedeprrafopredeter"/>
     <w:link w:val="Ttulo2"/>
     <w:uiPriority w:val="9"/>
-    <w:semiHidden/>
-    <w:rsid w:val="00040BA5"/>
+    <w:rsid w:val="00351892"/>
     <w:rPr>
       <w:rFonts w:eastAsiaTheme="majorEastAsia" w:cstheme="majorBidi"/>
+      <w:b/>
       <w:sz w:val="24"/>
       <w:szCs w:val="32"/>
     </w:rPr>
@@ -2143,7 +2681,7 @@
       <w:numPr>
         <w:numId w:val="0"/>
       </w:numPr>
-      <w:spacing w:before="240" w:after="0"/>
+      <w:spacing w:before="240"/>
       <w:outlineLvl w:val="9"/>
     </w:pPr>
     <w:rPr>
@@ -2221,11 +2759,10 @@
     <w:basedOn w:val="Normal"/>
     <w:next w:val="Normal"/>
     <w:qFormat/>
-    <w:rsid w:val="005F0801"/>
+    <w:rsid w:val="00351892"/>
     <w:pPr>
-      <w:spacing w:line="480" w:lineRule="auto"/>
-      <w:ind w:firstLine="709"/>
-      <w:jc w:val="both"/>
+      <w:spacing w:after="0" w:line="480" w:lineRule="auto"/>
+      <w:ind w:firstLine="720"/>
     </w:pPr>
     <w:rPr>
       <w:sz w:val="24"/>
@@ -2238,6 +2775,17 @@
     <w:uiPriority w:val="37"/>
     <w:unhideWhenUsed/>
     <w:rsid w:val="008A2FC3"/>
+  </w:style>
+  <w:style w:type="character" w:styleId="Fuerte">
+    <w:name w:val="Strong"/>
+    <w:basedOn w:val="Fuentedeprrafopredeter"/>
+    <w:uiPriority w:val="22"/>
+    <w:qFormat/>
+    <w:rsid w:val="00C97898"/>
+    <w:rPr>
+      <w:b/>
+      <w:bCs/>
+    </w:rPr>
   </w:style>
 </w:styles>
 </file>

</xml_diff>